<commit_message>
docs(pdf): add PDF bookmarks from heading styles, regen all cahiers
</commit_message>
<xml_diff>
--- a/docs/ALBAN ROUZAUD_2_JOURNAL NON ECRIT D'UN FANTASSIN EN REPLIS STRATEGIQUE.docx
+++ b/docs/ALBAN ROUZAUD_2_JOURNAL NON ECRIT D'UN FANTASSIN EN REPLIS STRATEGIQUE.docx
@@ -54,61 +54,11 @@
     </w:p>
     <w:p>
       <w:pPr>
-        <w:spacing w:after="0"/>
-        <w:jc w:val="both"/>
-        <w:rPr>
-          <w:lang w:val="fr-FR"/>
-        </w:rPr>
-      </w:pPr>
-    </w:p>
-    <w:p>
-      <w:pPr>
-        <w:spacing w:after="0"/>
-        <w:jc w:val="both"/>
-        <w:rPr>
-          <w:lang w:val="fr-FR"/>
-        </w:rPr>
-      </w:pPr>
-    </w:p>
-    <w:p>
-      <w:pPr>
-        <w:pStyle w:val="Titre1"/>
-      </w:pPr>
-      <w:r>
-        <w:t>JOURNAL NON ÉCRIT</w:t>
-      </w:r>
-    </w:p>
-    <w:p>
-      <w:pPr>
-        <w:spacing w:after="0"/>
-        <w:jc w:val="both"/>
-        <w:rPr>
-          <w:lang w:val="fr-FR"/>
-        </w:rPr>
-      </w:pPr>
-    </w:p>
-    <w:p>
-      <w:pPr>
-        <w:spacing w:after="0"/>
-        <w:jc w:val="both"/>
-        <w:rPr>
-          <w:lang w:val="fr-FR"/>
-        </w:rPr>
-      </w:pPr>
-    </w:p>
-    <w:p>
-      <w:pPr>
-        <w:jc w:val="both"/>
-        <w:rPr>
-          <w:lang w:val="fr-FR"/>
-        </w:rPr>
-      </w:pPr>
-      <w:r>
-        <w:rPr>
-          <w:lang w:val="fr-FR"/>
-        </w:rPr>
-        <w:br w:type="page"/>
-      </w:r>
+        <w:jc w:val="both"/>
+        <w:rPr>
+          <w:lang w:val="fr-FR"/>
+        </w:rPr>
+      </w:pPr>
     </w:p>
     <w:p>
       <w:pPr>
@@ -116,7 +66,6 @@
         <w:spacing w:after="240"/>
       </w:pPr>
       <w:r>
-        <w:lastRenderedPageBreak/>
         <w:t>Journal non écrit d'un fantassin en « Repli Stratégique »</w:t>
       </w:r>
     </w:p>
@@ -5167,36 +5116,6 @@
           <w:lang w:val="fr-FR"/>
         </w:rPr>
         <w:lastRenderedPageBreak/>
-        <w:t>Page(s) manquante(s)</w:t>
-      </w:r>
-    </w:p>
-    <w:p>
-      <w:pPr>
-        <w:spacing w:after="200"/>
-        <w:jc w:val="both"/>
-        <w:rPr>
-          <w:lang w:val="fr-FR"/>
-        </w:rPr>
-      </w:pPr>
-      <w:r>
-        <w:rPr>
-          <w:lang w:val="fr-FR"/>
-        </w:rPr>
-        <w:br w:type="page"/>
-      </w:r>
-    </w:p>
-    <w:p>
-      <w:pPr>
-        <w:jc w:val="both"/>
-        <w:rPr>
-          <w:lang w:val="fr-FR"/>
-        </w:rPr>
-      </w:pPr>
-      <w:r>
-        <w:rPr>
-          <w:lang w:val="fr-FR"/>
-        </w:rPr>
-        <w:lastRenderedPageBreak/>
         <w:t>[…]</w:t>
       </w:r>
       <w:r>
@@ -11851,6 +11770,7 @@
         <w:rPr>
           <w:lang w:val="fr-FR"/>
         </w:rPr>
+        <w:lastRenderedPageBreak/>
         <w:t>Après maints arrêts et maints démarrages nous échouons dans un enclos dont le sol est recouvert de gros galets. Debout sur un tertre un</w:t>
       </w:r>
       <w:r>
@@ -12629,8 +12549,9 @@
           <w:szCs w:val="24"/>
           <w:lang w:val="fr-FR"/>
         </w:rPr>
-        <w:t xml:space="preserve"> de l'éditeur) : L'eau de Seltz (orthographe correcte avec un </w:t>
-      </w:r>
+        <w:t xml:space="preserve"> de l'éditeur) : L'eau de Seltz (orthographe correcte avec un « t » : Seltz) est de l'eau gazeuse. Le nom vient de </w:t>
+      </w:r>
+      <w:proofErr w:type="spellStart"/>
       <w:r>
         <w:rPr>
           <w:i/>
@@ -12639,8 +12560,9 @@
           <w:szCs w:val="24"/>
           <w:lang w:val="fr-FR"/>
         </w:rPr>
-        <w:t>« </w:t>
-      </w:r>
+        <w:t>Selters</w:t>
+      </w:r>
+      <w:proofErr w:type="spellEnd"/>
       <w:r>
         <w:rPr>
           <w:i/>
@@ -12649,7 +12571,44 @@
           <w:szCs w:val="24"/>
           <w:lang w:val="fr-FR"/>
         </w:rPr>
-        <w:t>t</w:t>
+        <w:t>, une ville allemande connue pour ses sources d'eau minérale naturellement gazeuse.</w:t>
+      </w:r>
+    </w:p>
+    <w:p>
+      <w:pPr>
+        <w:pStyle w:val="Notedebasdepage"/>
+        <w:rPr>
+          <w:lang w:val="fr-FR"/>
+        </w:rPr>
+      </w:pPr>
+    </w:p>
+  </w:footnote>
+  <w:footnote w:id="6">
+    <w:p>
+      <w:pPr>
+        <w:pStyle w:val="Notedebasdepage"/>
+        <w:jc w:val="both"/>
+        <w:rPr>
+          <w:sz w:val="24"/>
+          <w:szCs w:val="24"/>
+          <w:lang w:val="fr-FR"/>
+        </w:rPr>
+      </w:pPr>
+      <w:r>
+        <w:rPr>
+          <w:rStyle w:val="Appelnotedebasdep"/>
+          <w:sz w:val="24"/>
+          <w:szCs w:val="24"/>
+        </w:rPr>
+        <w:footnoteRef/>
+      </w:r>
+      <w:r>
+        <w:rPr>
+          <w:sz w:val="24"/>
+          <w:szCs w:val="24"/>
+          <w:lang w:val="fr-FR"/>
+        </w:rPr>
+        <w:t xml:space="preserve"> </w:t>
       </w:r>
       <w:r>
         <w:rPr>
@@ -12659,8 +12618,9 @@
           <w:szCs w:val="24"/>
           <w:lang w:val="fr-FR"/>
         </w:rPr>
-        <w:t> »</w:t>
-      </w:r>
+        <w:t>(</w:t>
+      </w:r>
+      <w:proofErr w:type="gramStart"/>
       <w:r>
         <w:rPr>
           <w:i/>
@@ -12669,9 +12629,9 @@
           <w:szCs w:val="24"/>
           <w:lang w:val="fr-FR"/>
         </w:rPr>
-        <w:t xml:space="preserve"> : Seltz) est de l'eau gazeuse. Le nom vient de </w:t>
-      </w:r>
-      <w:proofErr w:type="spellStart"/>
+        <w:t>note</w:t>
+      </w:r>
+      <w:proofErr w:type="gramEnd"/>
       <w:r>
         <w:rPr>
           <w:i/>
@@ -12680,10 +12640,14 @@
           <w:szCs w:val="24"/>
           <w:lang w:val="fr-FR"/>
         </w:rPr>
-        <w:t>Selters</w:t>
-      </w:r>
-      <w:proofErr w:type="spellEnd"/>
-      <w:r>
+        <w:t xml:space="preserve"> de l'éditeur) : onomatopée ? ou erreur de transcription ?</w:t>
+      </w:r>
+    </w:p>
+  </w:footnote>
+  <w:footnote w:id="7">
+    <w:p>
+      <w:pPr>
+        <w:pStyle w:val="Notedebasdepage"/>
         <w:rPr>
           <w:i/>
           <w:iCs/>
@@ -12691,56 +12655,17 @@
           <w:szCs w:val="24"/>
           <w:lang w:val="fr-FR"/>
         </w:rPr>
-        <w:t>, une ville allemande connue pour ses sources d'eau minérale naturellement gazeuse.</w:t>
-      </w:r>
-    </w:p>
-    <w:p>
-      <w:pPr>
-        <w:pStyle w:val="Notedebasdepage"/>
-        <w:rPr>
-          <w:lang w:val="fr-FR"/>
-        </w:rPr>
-      </w:pPr>
-    </w:p>
-  </w:footnote>
-  <w:footnote w:id="6">
-    <w:p>
-      <w:pPr>
-        <w:pStyle w:val="Notedebasdepage"/>
-        <w:jc w:val="both"/>
-        <w:rPr>
-          <w:sz w:val="24"/>
-          <w:szCs w:val="24"/>
-          <w:lang w:val="fr-FR"/>
-        </w:rPr>
       </w:pPr>
       <w:r>
         <w:rPr>
           <w:rStyle w:val="Appelnotedebasdep"/>
-          <w:sz w:val="24"/>
-          <w:szCs w:val="24"/>
-        </w:rPr>
-        <w:footnoteRef/>
-      </w:r>
-      <w:r>
-        <w:rPr>
-          <w:sz w:val="24"/>
-          <w:szCs w:val="24"/>
-          <w:lang w:val="fr-FR"/>
-        </w:rPr>
-        <w:t xml:space="preserve"> </w:t>
-      </w:r>
-      <w:r>
-        <w:rPr>
           <w:i/>
           <w:iCs/>
           <w:sz w:val="24"/>
           <w:szCs w:val="24"/>
-          <w:lang w:val="fr-FR"/>
-        </w:rPr>
-        <w:t>(</w:t>
-      </w:r>
-      <w:proofErr w:type="gramStart"/>
+        </w:rPr>
+        <w:footnoteRef/>
+      </w:r>
       <w:r>
         <w:rPr>
           <w:i/>
@@ -12749,68 +12674,7 @@
           <w:szCs w:val="24"/>
           <w:lang w:val="fr-FR"/>
         </w:rPr>
-        <w:t>note</w:t>
-      </w:r>
-      <w:proofErr w:type="gramEnd"/>
-      <w:r>
-        <w:rPr>
-          <w:i/>
-          <w:iCs/>
-          <w:sz w:val="24"/>
-          <w:szCs w:val="24"/>
-          <w:lang w:val="fr-FR"/>
-        </w:rPr>
-        <w:t xml:space="preserve"> de l'éditeur) : </w:t>
-      </w:r>
-      <w:r>
-        <w:rPr>
-          <w:i/>
-          <w:iCs/>
-          <w:sz w:val="24"/>
-          <w:szCs w:val="24"/>
-          <w:lang w:val="fr-FR"/>
-        </w:rPr>
-        <w:t>onomatopée ? ou erreur de transcription ?</w:t>
-      </w:r>
-    </w:p>
-  </w:footnote>
-  <w:footnote w:id="7">
-    <w:p>
-      <w:pPr>
-        <w:pStyle w:val="Notedebasdepage"/>
-        <w:rPr>
-          <w:lang w:val="fr-FR"/>
-        </w:rPr>
-      </w:pPr>
-      <w:r>
-        <w:rPr>
-          <w:rStyle w:val="Appelnotedebasdep"/>
-        </w:rPr>
-        <w:footnoteRef/>
-      </w:r>
-      <w:r>
-        <w:rPr>
-          <w:lang w:val="fr-FR"/>
-        </w:rPr>
-        <w:t xml:space="preserve"> </w:t>
-      </w:r>
-      <w:r>
-        <w:rPr>
-          <w:lang w:val="fr-FR"/>
-        </w:rPr>
-        <w:t>Page(s) manquante(s)</w:t>
-      </w:r>
-      <w:r>
-        <w:rPr>
-          <w:lang w:val="fr-FR"/>
-        </w:rPr>
-        <w:t xml:space="preserve"> dans l</w:t>
-      </w:r>
-      <w:r>
-        <w:rPr>
-          <w:lang w:val="fr-FR"/>
-        </w:rPr>
-        <w:t>e cahier manuscrit</w:t>
+        <w:t xml:space="preserve"> Page(s) manquante(s) dans le cahier manuscrit</w:t>
       </w:r>
     </w:p>
   </w:footnote>

</xml_diff>